<commit_message>
docs(creadores): plantilla de email para envio del contrato (md+docx)
Nueva plantilla EMAIL-MODELO-ENVIO-CONTRATO.md (con su .docx generado) para mandar al creador junto con el contrato personalizado, una vez que ya hay confirmacion de interes por WhatsApp/telefono.

Incluye:

- Cabecera del email (para/cc/asunto/adjuntos) con placeholders.

- Cuerpo largo (primera vez) con resumen del acuerdo, modelo cobro+reembolso, plazos del ciclo, cesion de derechos sin exclusividad y proximos pasos.

- Cuerpo corto opcional para cuando ya esta todo aclarado por WhatsApp.

- Notas internas (checklist antes de enviar, recordatorios automaticos).

Guia interna sincronizada con referencia cruzada al nuevo email en el flujo operativo y en los punteros.

Co-authored-by: Cursor <cursoragent@cursor.com>
</commit_message>
<xml_diff>
--- a/contrato_colaboradores/GUIA-INTERNA-PROGRAMA-CREADORES.docx
+++ b/contrato_colaboradores/GUIA-INTERNA-PROGRAMA-CREADORES.docx
@@ -28,7 +28,7 @@
         </w:p>
       </w:sdtContent>
     </w:sdt>
-    <w:bookmarkStart w:id="48" w:name="X477356e3f6f88687d0fa120f18687bb88fca39c"/>
+    <w:bookmarkStart w:id="49" w:name="X477356e3f6f88687d0fa120f18687bb88fca39c"/>
     <w:p>
       <w:pPr>
         <w:pStyle w:val="Heading1"/>
@@ -2102,7 +2102,7 @@
       </w:r>
     </w:p>
     <w:bookmarkEnd w:id="22"/>
-    <w:bookmarkStart w:id="26" w:name="Xdf5e565c36c45190174368d6c71eaf65141f325"/>
+    <w:bookmarkStart w:id="27" w:name="Xdf5e565c36c45190174368d6c71eaf65141f325"/>
     <w:p>
       <w:pPr>
         <w:pStyle w:val="Heading2"/>
@@ -2111,7 +2111,7 @@
         <w:t xml:space="preserve">8 · Flujo operativo paso a paso</w:t>
       </w:r>
     </w:p>
-    <w:bookmarkStart w:id="23" w:name="antes-del-viaje"/>
+    <w:bookmarkStart w:id="24" w:name="antes-del-viaje"/>
     <w:p>
       <w:pPr>
         <w:pStyle w:val="Heading3"/>
@@ -2280,7 +2280,24 @@
         <w:t xml:space="preserve"> </w:t>
       </w:r>
       <w:r>
-        <w:t xml:space="preserve">rellenos.</w:t>
+        <w:t xml:space="preserve">rellenos, acompañado del email tipo</w:t>
+      </w:r>
+      <w:r>
+        <w:t xml:space="preserve"> </w:t>
+      </w:r>
+      <w:hyperlink r:id="rId23">
+        <w:r>
+          <w:rPr>
+            <w:rStyle w:val="VerbatimChar"/>
+          </w:rPr>
+          <w:t xml:space="preserve">EMAIL-MODELO-ENVIO-CONTRATO.md</w:t>
+        </w:r>
+      </w:hyperlink>
+      <w:r>
+        <w:t xml:space="preserve"> </w:t>
+      </w:r>
+      <w:r>
+        <w:t xml:space="preserve">(versión larga la primera vez, versión corta si ya está todo aclarado por WhatsApp).</w:t>
       </w:r>
     </w:p>
     <w:p>
@@ -2376,8 +2393,8 @@
         <w:t xml:space="preserve">si el creador prevé personas reconocibles distintas a él mismo.</w:t>
       </w:r>
     </w:p>
-    <w:bookmarkEnd w:id="23"/>
-    <w:bookmarkStart w:id="24" w:name="durante-el-viaje"/>
+    <w:bookmarkEnd w:id="24"/>
+    <w:bookmarkStart w:id="25" w:name="durante-el-viaje"/>
     <w:p>
       <w:pPr>
         <w:pStyle w:val="Heading3"/>
@@ -2410,8 +2427,8 @@
         <w:t xml:space="preserve">Si el creador pide algo extra (segundo conductor, salir de España, etc.), va por la vía habitual y por escrito.</w:t>
       </w:r>
     </w:p>
-    <w:bookmarkEnd w:id="24"/>
-    <w:bookmarkStart w:id="25" w:name="después-del-viaje"/>
+    <w:bookmarkEnd w:id="25"/>
+    <w:bookmarkStart w:id="26" w:name="después-del-viaje"/>
     <w:p>
       <w:pPr>
         <w:pStyle w:val="Heading3"/>
@@ -2609,9 +2626,9 @@
         </w:pict>
       </w:r>
     </w:p>
-    <w:bookmarkEnd w:id="25"/>
     <w:bookmarkEnd w:id="26"/>
-    <w:bookmarkStart w:id="37" w:name="X7aede9213a1b639097e416842bb4bdda3f26f6c"/>
+    <w:bookmarkEnd w:id="27"/>
+    <w:bookmarkStart w:id="38" w:name="X7aede9213a1b639097e416842bb4bdda3f26f6c"/>
     <w:p>
       <w:pPr>
         <w:pStyle w:val="Heading2"/>
@@ -2620,7 +2637,7 @@
         <w:t xml:space="preserve">9 · Preguntas frecuentes que nos hacen (respuesta corta)</w:t>
       </w:r>
     </w:p>
-    <w:bookmarkStart w:id="27" w:name="cuáles-son-los-mínimos-exactos"/>
+    <w:bookmarkStart w:id="28" w:name="cuáles-son-los-mínimos-exactos"/>
     <w:p>
       <w:pPr>
         <w:pStyle w:val="Heading3"/>
@@ -2637,8 +2654,8 @@
         <w:t xml:space="preserve">→ Tabla del §2 + criterios técnicos del §3. Se cierra por escrito en el Anexo I del contrato, con cantidades exactas.</w:t>
       </w:r>
     </w:p>
-    <w:bookmarkEnd w:id="27"/>
-    <w:bookmarkStart w:id="28" w:name="Xf781cb16bd64f5e5f7e62fdd280eec7081ec997"/>
+    <w:bookmarkEnd w:id="28"/>
+    <w:bookmarkStart w:id="29" w:name="Xf781cb16bd64f5e5f7e62fdd280eec7081ec997"/>
     <w:p>
       <w:pPr>
         <w:pStyle w:val="Heading3"/>
@@ -2655,8 +2672,8 @@
         <w:t xml:space="preserve">→ Para proteger la fianza. Si fusionáramos riesgos, podríamos quedarnos sin reparar daños. Tú recuperas el 100 % cuando entregues lo pactado.</w:t>
       </w:r>
     </w:p>
-    <w:bookmarkEnd w:id="28"/>
-    <w:bookmarkStart w:id="29" w:name="y-si-entrego-casi-todo"/>
+    <w:bookmarkEnd w:id="29"/>
+    <w:bookmarkStart w:id="30" w:name="y-si-entrego-casi-todo"/>
     <w:p>
       <w:pPr>
         <w:pStyle w:val="Heading3"/>
@@ -2673,8 +2690,8 @@
         <w:t xml:space="preserve">→ Si superas el 80 % de los mínimos te ofrecemos una sola subsanación de 7 días. Por debajo, no procede reembolso.</w:t>
       </w:r>
     </w:p>
-    <w:bookmarkEnd w:id="29"/>
-    <w:bookmarkStart w:id="30" w:name="me-exigís-exclusividad"/>
+    <w:bookmarkEnd w:id="30"/>
+    <w:bookmarkStart w:id="31" w:name="me-exigís-exclusividad"/>
     <w:p>
       <w:pPr>
         <w:pStyle w:val="Heading3"/>
@@ -2704,8 +2721,8 @@
         <w:t xml:space="preserve">. Puedes seguir colaborando con quien quieras antes, durante y después. Lo único que aplica al material que nos cedes es la idoneidad de marca (no marcas competidoras visibles, etc.).</w:t>
       </w:r>
     </w:p>
-    <w:bookmarkEnd w:id="30"/>
-    <w:bookmarkStart w:id="31" w:name="puedo-publicar-el-material-en-mis-redes"/>
+    <w:bookmarkEnd w:id="31"/>
+    <w:bookmarkStart w:id="32" w:name="puedo-publicar-el-material-en-mis-redes"/>
     <w:p>
       <w:pPr>
         <w:pStyle w:val="Heading3"/>
@@ -2722,8 +2739,8 @@
         <w:t xml:space="preserve">→ Sí, la pieza editada desde el momento de la entrega. Lo único que pedimos no divulgar son importes y tarifas internas.</w:t>
       </w:r>
     </w:p>
-    <w:bookmarkEnd w:id="31"/>
-    <w:bookmarkStart w:id="32" w:name="conservo-la-autoría"/>
+    <w:bookmarkEnd w:id="32"/>
+    <w:bookmarkStart w:id="33" w:name="conservo-la-autoría"/>
     <w:p>
       <w:pPr>
         <w:pStyle w:val="Heading3"/>
@@ -2756,8 +2773,8 @@
         <w:t xml:space="preserve">con derecho de modificación. Tú puedes seguir usando el material en tu portfolio.</w:t>
       </w:r>
     </w:p>
-    <w:bookmarkEnd w:id="32"/>
-    <w:bookmarkStart w:id="33" w:name="X678e1099f95b7043f4b94397eb077b5a7af2f90"/>
+    <w:bookmarkEnd w:id="33"/>
+    <w:bookmarkStart w:id="34" w:name="X678e1099f95b7043f4b94397eb077b5a7af2f90"/>
     <w:p>
       <w:pPr>
         <w:pStyle w:val="Heading3"/>
@@ -2774,8 +2791,8 @@
         <w:t xml:space="preserve">→ Te ofrecemos vehículo equivalente, reprogramación dentro del periodo permitido o cancelación íntegra con reembolso. No procede lucro cesante.</w:t>
       </w:r>
     </w:p>
-    <w:bookmarkEnd w:id="33"/>
-    <w:bookmarkStart w:id="34" w:name="Xafed4477accd223df74d7ab4ffa64a9e59c895e"/>
+    <w:bookmarkEnd w:id="34"/>
+    <w:bookmarkStart w:id="35" w:name="Xafed4477accd223df74d7ab4ffa64a9e59c895e"/>
     <w:p>
       <w:pPr>
         <w:pStyle w:val="Heading3"/>
@@ -2792,8 +2809,8 @@
         <w:t xml:space="preserve">→ No. Solo octubre–mayo y huecos puntuales en otras temporadas. Sin excepciones para temporada alta de verano, Semana Santa, puentes ni picos navideños.</w:t>
       </w:r>
     </w:p>
-    <w:bookmarkEnd w:id="34"/>
-    <w:bookmarkStart w:id="35" w:name="cuántos-seguidores-necesito"/>
+    <w:bookmarkEnd w:id="35"/>
+    <w:bookmarkStart w:id="36" w:name="cuántos-seguidores-necesito"/>
     <w:p>
       <w:pPr>
         <w:pStyle w:val="Heading3"/>
@@ -2810,8 +2827,8 @@
         <w:t xml:space="preserve">→ No es el criterio principal. Pesa más el portfolio, la propuesta y la calidad técnica que la audiencia.</w:t>
       </w:r>
     </w:p>
-    <w:bookmarkEnd w:id="35"/>
-    <w:bookmarkStart w:id="36" w:name="vale-grabar-con-móvil"/>
+    <w:bookmarkEnd w:id="36"/>
+    <w:bookmarkStart w:id="37" w:name="vale-grabar-con-móvil"/>
     <w:p>
       <w:pPr>
         <w:pStyle w:val="Heading3"/>
@@ -2835,9 +2852,9 @@
         </w:pict>
       </w:r>
     </w:p>
-    <w:bookmarkEnd w:id="36"/>
     <w:bookmarkEnd w:id="37"/>
-    <w:bookmarkStart w:id="42" w:name="X07cbef3597673a01fb528e6a577b16a5a9fced7"/>
+    <w:bookmarkEnd w:id="38"/>
+    <w:bookmarkStart w:id="43" w:name="X07cbef3597673a01fb528e6a577b16a5a9fced7"/>
     <w:p>
       <w:pPr>
         <w:pStyle w:val="Heading2"/>
@@ -2846,7 +2863,7 @@
         <w:t xml:space="preserve">10 · Plantillas de email/WhatsApp</w:t>
       </w:r>
     </w:p>
-    <w:bookmarkStart w:id="38" w:name="X180e01a7685abeafa9c655529a9d7b1322148ba"/>
+    <w:bookmarkStart w:id="39" w:name="X180e01a7685abeafa9c655529a9d7b1322148ba"/>
     <w:p>
       <w:pPr>
         <w:pStyle w:val="Heading3"/>
@@ -2968,8 +2985,8 @@
         <w:t xml:space="preserve">Si te encaja, dime fechas firmes y te paso el contrato personalizado para revisión.</w:t>
       </w:r>
     </w:p>
-    <w:bookmarkEnd w:id="38"/>
-    <w:bookmarkStart w:id="39" w:name="Xad0db7d6baa0f2c134f1a089ac14a9636b0c89b"/>
+    <w:bookmarkEnd w:id="39"/>
+    <w:bookmarkStart w:id="40" w:name="Xad0db7d6baa0f2c134f1a089ac14a9636b0c89b"/>
     <w:p>
       <w:pPr>
         <w:pStyle w:val="Heading3"/>
@@ -3039,8 +3056,8 @@
         <w:t xml:space="preserve">Mil gracias por el material, lo vamos a usar muchísimo.</w:t>
       </w:r>
     </w:p>
-    <w:bookmarkEnd w:id="39"/>
-    <w:bookmarkStart w:id="40" w:name="X037b77f7b98283dc86b820aeafc4edd2ea43eb1"/>
+    <w:bookmarkEnd w:id="40"/>
+    <w:bookmarkStart w:id="41" w:name="X037b77f7b98283dc86b820aeafc4edd2ea43eb1"/>
     <w:p>
       <w:pPr>
         <w:pStyle w:val="Heading3"/>
@@ -3114,8 +3131,8 @@
         <w:t xml:space="preserve">. Al recibir tu confirmación se reabre la revisión cuando completes. Si no aceptas o no llega lo faltante dentro del plazo, la entrega quedará como «no cumple» y el alquiler permanecerá facturado.</w:t>
       </w:r>
     </w:p>
-    <w:bookmarkEnd w:id="40"/>
-    <w:bookmarkStart w:id="41" w:name="Xdbc1cfe84964c17fc6ea2ccbabaff9846e4dcb6"/>
+    <w:bookmarkEnd w:id="41"/>
+    <w:bookmarkStart w:id="42" w:name="Xdbc1cfe84964c17fc6ea2ccbabaff9846e4dcb6"/>
     <w:p>
       <w:pPr>
         <w:pStyle w:val="Heading3"/>
@@ -3204,9 +3221,9 @@
         </w:pict>
       </w:r>
     </w:p>
-    <w:bookmarkEnd w:id="41"/>
     <w:bookmarkEnd w:id="42"/>
-    <w:bookmarkStart w:id="43" w:name="Xeeb53425ca27690529bb9174a2f834fd2333c43"/>
+    <w:bookmarkEnd w:id="43"/>
+    <w:bookmarkStart w:id="44" w:name="Xeeb53425ca27690529bb9174a2f834fd2333c43"/>
     <w:p>
       <w:pPr>
         <w:pStyle w:val="Heading2"/>
@@ -3342,8 +3359,8 @@
         </w:pict>
       </w:r>
     </w:p>
-    <w:bookmarkEnd w:id="43"/>
-    <w:bookmarkStart w:id="47" w:name="X5ff63a775662e4fc08566295e8a944186439b1e"/>
+    <w:bookmarkEnd w:id="44"/>
+    <w:bookmarkStart w:id="48" w:name="X5ff63a775662e4fc08566295e8a944186439b1e"/>
     <w:p>
       <w:pPr>
         <w:pStyle w:val="Heading2"/>
@@ -3352,7 +3369,7 @@
         <w:t xml:space="preserve">12 · Punteros</w:t>
       </w:r>
     </w:p>
-    <w:bookmarkStart w:id="44" w:name="en-código"/>
+    <w:bookmarkStart w:id="45" w:name="en-código"/>
     <w:p>
       <w:pPr>
         <w:pStyle w:val="Heading3"/>
@@ -3493,8 +3510,8 @@
         <w:t xml:space="preserve">.</w:t>
       </w:r>
     </w:p>
-    <w:bookmarkEnd w:id="44"/>
-    <w:bookmarkStart w:id="45" w:name="en-documentación"/>
+    <w:bookmarkEnd w:id="45"/>
+    <w:bookmarkStart w:id="46" w:name="en-documentación"/>
     <w:p>
       <w:pPr>
         <w:pStyle w:val="Heading3"/>
@@ -3538,6 +3555,32 @@
         </w:numPr>
       </w:pPr>
       <w:r>
+        <w:t xml:space="preserve">Email tipo de envío del contrato:</w:t>
+      </w:r>
+      <w:r>
+        <w:t xml:space="preserve"> </w:t>
+      </w:r>
+      <w:hyperlink r:id="rId23">
+        <w:r>
+          <w:rPr>
+            <w:rStyle w:val="VerbatimChar"/>
+          </w:rPr>
+          <w:t xml:space="preserve">./EMAIL-MODELO-ENVIO-CONTRATO.md</w:t>
+        </w:r>
+      </w:hyperlink>
+      <w:r>
+        <w:t xml:space="preserve">.</w:t>
+      </w:r>
+    </w:p>
+    <w:p>
+      <w:pPr>
+        <w:pStyle w:val="Compact"/>
+        <w:numPr>
+          <w:ilvl w:val="0"/>
+          <w:numId w:val="1019"/>
+        </w:numPr>
+      </w:pPr>
+      <w:r>
         <w:t xml:space="preserve">Guía interna (este documento):</w:t>
       </w:r>
       <w:r>
@@ -3604,8 +3647,8 @@
         <w:t xml:space="preserve">.</w:t>
       </w:r>
     </w:p>
-    <w:bookmarkEnd w:id="45"/>
-    <w:bookmarkStart w:id="46" w:name="en-el-sistema"/>
+    <w:bookmarkEnd w:id="46"/>
+    <w:bookmarkStart w:id="47" w:name="en-el-sistema"/>
     <w:p>
       <w:pPr>
         <w:pStyle w:val="Heading3"/>
@@ -3726,9 +3769,9 @@
         <w:t xml:space="preserve">· Última actualización: 2026-05-14 · Si actualizas niveles, plazos o el modelo económico, recuerda sincronizar landing pública, contrato modelo y esta guía en el mismo commit.</w:t>
       </w:r>
     </w:p>
-    <w:bookmarkEnd w:id="46"/>
     <w:bookmarkEnd w:id="47"/>
     <w:bookmarkEnd w:id="48"/>
+    <w:bookmarkEnd w:id="49"/>
     <w:sectPr>
       <w:footnotePr>
         <w:numRestart w:val="eachSect"/>

</xml_diff>